<commit_message>
updated the migration files and also created the model files
</commit_message>
<xml_diff>
--- a/rbac final.docx
+++ b/rbac final.docx
@@ -2226,47 +2226,6 @@
           <w:color w:val="188038"/>
         </w:rPr>
         <w:t>default_landing_page</w:t>
-      </w:r>
-      <w:proofErr w:type="spellEnd"/>
-      <w:r>
-        <w:rPr>
-          <w:rFonts w:ascii="Roboto Mono" w:eastAsia="Roboto Mono" w:hAnsi="Roboto Mono" w:cs="Roboto Mono"/>
-          <w:color w:val="188038"/>
-        </w:rPr>
-        <w:t xml:space="preserve"> [</w:t>
-      </w:r>
-      <w:proofErr w:type="spellStart"/>
-      <w:r>
-        <w:rPr>
-          <w:rFonts w:ascii="Roboto Mono" w:eastAsia="Roboto Mono" w:hAnsi="Roboto Mono" w:cs="Roboto Mono"/>
-          <w:color w:val="188038"/>
-        </w:rPr>
-        <w:t>varchar</w:t>
-      </w:r>
-      <w:proofErr w:type="spellEnd"/>
-      <w:r>
-        <w:rPr>
-          <w:rFonts w:ascii="Roboto Mono" w:eastAsia="Roboto Mono" w:hAnsi="Roboto Mono" w:cs="Roboto Mono"/>
-          <w:color w:val="188038"/>
-        </w:rPr>
-        <w:t>]</w:t>
-      </w:r>
-    </w:p>
-    <w:p>
-      <w:pPr>
-        <w:pStyle w:val="Normal1"/>
-        <w:rPr>
-          <w:rFonts w:ascii="Roboto Mono" w:eastAsia="Roboto Mono" w:hAnsi="Roboto Mono" w:cs="Roboto Mono"/>
-          <w:color w:val="188038"/>
-        </w:rPr>
-      </w:pPr>
-      <w:proofErr w:type="spellStart"/>
-      <w:r>
-        <w:rPr>
-          <w:rFonts w:ascii="Roboto Mono" w:eastAsia="Roboto Mono" w:hAnsi="Roboto Mono" w:cs="Roboto Mono"/>
-          <w:color w:val="188038"/>
-        </w:rPr>
-        <w:t>default_record_view</w:t>
       </w:r>
       <w:proofErr w:type="spellEnd"/>
       <w:r>
@@ -3207,7 +3166,6 @@
           <w:sz w:val="34"/>
           <w:szCs w:val="34"/>
         </w:rPr>
-        <w:lastRenderedPageBreak/>
         <w:t>roles</w:t>
       </w:r>
       <w:proofErr w:type="gramEnd"/>
@@ -4121,73 +4079,73 @@
           <w:rFonts w:ascii="Roboto Mono" w:eastAsia="Roboto Mono" w:hAnsi="Roboto Mono" w:cs="Roboto Mono"/>
           <w:color w:val="188038"/>
         </w:rPr>
+        <w:t>assigned_by</w:t>
+      </w:r>
+      <w:proofErr w:type="spellEnd"/>
+      <w:r>
+        <w:rPr>
+          <w:rFonts w:ascii="Roboto Mono" w:eastAsia="Roboto Mono" w:hAnsi="Roboto Mono" w:cs="Roboto Mono"/>
+          <w:color w:val="188038"/>
+        </w:rPr>
+        <w:t xml:space="preserve"> [</w:t>
+      </w:r>
+      <w:proofErr w:type="spellStart"/>
+      <w:r>
+        <w:rPr>
+          <w:rFonts w:ascii="Roboto Mono" w:eastAsia="Roboto Mono" w:hAnsi="Roboto Mono" w:cs="Roboto Mono"/>
+          <w:color w:val="188038"/>
+        </w:rPr>
+        <w:t>bigint</w:t>
+      </w:r>
+      <w:proofErr w:type="spellEnd"/>
+      <w:r>
+        <w:rPr>
+          <w:rFonts w:ascii="Roboto Mono" w:eastAsia="Roboto Mono" w:hAnsi="Roboto Mono" w:cs="Roboto Mono"/>
+          <w:color w:val="188038"/>
+        </w:rPr>
+        <w:t>] (</w:t>
+      </w:r>
+      <w:proofErr w:type="spellStart"/>
+      <w:r>
+        <w:rPr>
+          <w:rFonts w:ascii="Roboto Mono" w:eastAsia="Roboto Mono" w:hAnsi="Roboto Mono" w:cs="Roboto Mono"/>
+          <w:color w:val="188038"/>
+        </w:rPr>
+        <w:t>fk</w:t>
+      </w:r>
+      <w:proofErr w:type="spellEnd"/>
+      <w:r>
+        <w:rPr>
+          <w:rFonts w:ascii="Roboto Mono" w:eastAsia="Roboto Mono" w:hAnsi="Roboto Mono" w:cs="Roboto Mono"/>
+          <w:color w:val="188038"/>
+        </w:rPr>
+        <w:t xml:space="preserve"> -&gt; users.id)</w:t>
+      </w:r>
+    </w:p>
+    <w:p>
+      <w:pPr>
+        <w:pStyle w:val="Normal1"/>
+        <w:rPr>
+          <w:rFonts w:ascii="Roboto Mono" w:eastAsia="Roboto Mono" w:hAnsi="Roboto Mono" w:cs="Roboto Mono"/>
+          <w:color w:val="188038"/>
+        </w:rPr>
+      </w:pPr>
+    </w:p>
+    <w:p>
+      <w:pPr>
+        <w:pStyle w:val="Normal1"/>
+        <w:rPr>
+          <w:rFonts w:ascii="Roboto Mono" w:eastAsia="Roboto Mono" w:hAnsi="Roboto Mono" w:cs="Roboto Mono"/>
+          <w:color w:val="188038"/>
+        </w:rPr>
+      </w:pPr>
+      <w:proofErr w:type="gramStart"/>
+      <w:r>
+        <w:rPr>
+          <w:rFonts w:ascii="Roboto Mono" w:eastAsia="Roboto Mono" w:hAnsi="Roboto Mono" w:cs="Roboto Mono"/>
+          <w:color w:val="188038"/>
+        </w:rPr>
         <w:lastRenderedPageBreak/>
-        <w:t>assigned_by</w:t>
-      </w:r>
-      <w:proofErr w:type="spellEnd"/>
-      <w:r>
-        <w:rPr>
-          <w:rFonts w:ascii="Roboto Mono" w:eastAsia="Roboto Mono" w:hAnsi="Roboto Mono" w:cs="Roboto Mono"/>
-          <w:color w:val="188038"/>
-        </w:rPr>
-        <w:t xml:space="preserve"> [</w:t>
-      </w:r>
-      <w:proofErr w:type="spellStart"/>
-      <w:r>
-        <w:rPr>
-          <w:rFonts w:ascii="Roboto Mono" w:eastAsia="Roboto Mono" w:hAnsi="Roboto Mono" w:cs="Roboto Mono"/>
-          <w:color w:val="188038"/>
-        </w:rPr>
-        <w:t>bigint</w:t>
-      </w:r>
-      <w:proofErr w:type="spellEnd"/>
-      <w:r>
-        <w:rPr>
-          <w:rFonts w:ascii="Roboto Mono" w:eastAsia="Roboto Mono" w:hAnsi="Roboto Mono" w:cs="Roboto Mono"/>
-          <w:color w:val="188038"/>
-        </w:rPr>
-        <w:t>] (</w:t>
-      </w:r>
-      <w:proofErr w:type="spellStart"/>
-      <w:r>
-        <w:rPr>
-          <w:rFonts w:ascii="Roboto Mono" w:eastAsia="Roboto Mono" w:hAnsi="Roboto Mono" w:cs="Roboto Mono"/>
-          <w:color w:val="188038"/>
-        </w:rPr>
-        <w:t>fk</w:t>
-      </w:r>
-      <w:proofErr w:type="spellEnd"/>
-      <w:r>
-        <w:rPr>
-          <w:rFonts w:ascii="Roboto Mono" w:eastAsia="Roboto Mono" w:hAnsi="Roboto Mono" w:cs="Roboto Mono"/>
-          <w:color w:val="188038"/>
-        </w:rPr>
-        <w:t xml:space="preserve"> -&gt; users.id)</w:t>
-      </w:r>
-    </w:p>
-    <w:p>
-      <w:pPr>
-        <w:pStyle w:val="Normal1"/>
-        <w:rPr>
-          <w:rFonts w:ascii="Roboto Mono" w:eastAsia="Roboto Mono" w:hAnsi="Roboto Mono" w:cs="Roboto Mono"/>
-          <w:color w:val="188038"/>
-        </w:rPr>
-      </w:pPr>
-    </w:p>
-    <w:p>
-      <w:pPr>
-        <w:pStyle w:val="Normal1"/>
-        <w:rPr>
-          <w:rFonts w:ascii="Roboto Mono" w:eastAsia="Roboto Mono" w:hAnsi="Roboto Mono" w:cs="Roboto Mono"/>
-          <w:color w:val="188038"/>
-        </w:rPr>
-      </w:pPr>
-      <w:proofErr w:type="gramStart"/>
-      <w:r>
-        <w:rPr>
-          <w:rFonts w:ascii="Roboto Mono" w:eastAsia="Roboto Mono" w:hAnsi="Roboto Mono" w:cs="Roboto Mono"/>
-          <w:color w:val="188038"/>
-        </w:rPr>
         <w:t>primary</w:t>
       </w:r>
       <w:proofErr w:type="gramEnd"/>
@@ -5083,7 +5041,6 @@
         <w:pStyle w:val="Normal1"/>
       </w:pPr>
       <w:r>
-        <w:lastRenderedPageBreak/>
         <w:pict>
           <v:rect id="_x0000_i1031" style="width:0;height:1.5pt" o:hralign="center" o:hrstd="t" o:hr="t" fillcolor="#a0a0a0" stroked="f"/>
         </w:pict>
@@ -5112,6 +5069,7 @@
           <w:sz w:val="34"/>
           <w:szCs w:val="34"/>
         </w:rPr>
+        <w:lastRenderedPageBreak/>
         <w:t>modules</w:t>
       </w:r>
       <w:proofErr w:type="gramEnd"/>
@@ -5965,34 +5923,34 @@
           <w:sz w:val="34"/>
           <w:szCs w:val="34"/>
         </w:rPr>
+        <w:t>profile_permissions</w:t>
+      </w:r>
+      <w:proofErr w:type="spellEnd"/>
+    </w:p>
+    <w:p>
+      <w:pPr>
+        <w:pStyle w:val="Normal1"/>
+        <w:rPr>
+          <w:rFonts w:ascii="Roboto Mono" w:eastAsia="Roboto Mono" w:hAnsi="Roboto Mono" w:cs="Roboto Mono"/>
+          <w:color w:val="188038"/>
+        </w:rPr>
+      </w:pPr>
+    </w:p>
+    <w:p>
+      <w:pPr>
+        <w:pStyle w:val="Normal1"/>
+        <w:rPr>
+          <w:rFonts w:ascii="Roboto Mono" w:eastAsia="Roboto Mono" w:hAnsi="Roboto Mono" w:cs="Roboto Mono"/>
+          <w:color w:val="188038"/>
+        </w:rPr>
+      </w:pPr>
+      <w:proofErr w:type="spellStart"/>
+      <w:r>
+        <w:rPr>
+          <w:rFonts w:ascii="Roboto Mono" w:eastAsia="Roboto Mono" w:hAnsi="Roboto Mono" w:cs="Roboto Mono"/>
+          <w:color w:val="188038"/>
+        </w:rPr>
         <w:lastRenderedPageBreak/>
-        <w:t>profile_permissions</w:t>
-      </w:r>
-      <w:proofErr w:type="spellEnd"/>
-    </w:p>
-    <w:p>
-      <w:pPr>
-        <w:pStyle w:val="Normal1"/>
-        <w:rPr>
-          <w:rFonts w:ascii="Roboto Mono" w:eastAsia="Roboto Mono" w:hAnsi="Roboto Mono" w:cs="Roboto Mono"/>
-          <w:color w:val="188038"/>
-        </w:rPr>
-      </w:pPr>
-    </w:p>
-    <w:p>
-      <w:pPr>
-        <w:pStyle w:val="Normal1"/>
-        <w:rPr>
-          <w:rFonts w:ascii="Roboto Mono" w:eastAsia="Roboto Mono" w:hAnsi="Roboto Mono" w:cs="Roboto Mono"/>
-          <w:color w:val="188038"/>
-        </w:rPr>
-      </w:pPr>
-      <w:proofErr w:type="spellStart"/>
-      <w:r>
-        <w:rPr>
-          <w:rFonts w:ascii="Roboto Mono" w:eastAsia="Roboto Mono" w:hAnsi="Roboto Mono" w:cs="Roboto Mono"/>
-          <w:color w:val="188038"/>
-        </w:rPr>
         <w:t>profile_id</w:t>
       </w:r>
       <w:proofErr w:type="spellEnd"/>
@@ -6916,7 +6874,6 @@
         </w:rPr>
       </w:pPr>
       <w:r>
-        <w:lastRenderedPageBreak/>
         <w:pict>
           <v:rect id="_x0000_i1036" style="width:0;height:1.5pt" o:hralign="center" o:hrstd="t" o:hr="t" fillcolor="#a0a0a0" stroked="f"/>
         </w:pict>
@@ -6951,6 +6908,7 @@
           <w:sz w:val="34"/>
           <w:szCs w:val="34"/>
         </w:rPr>
+        <w:lastRenderedPageBreak/>
         <w:t>group_roles</w:t>
       </w:r>
       <w:proofErr w:type="spellEnd"/>
@@ -7820,73 +7778,73 @@
           <w:rFonts w:ascii="Roboto Mono" w:eastAsia="Roboto Mono" w:hAnsi="Roboto Mono" w:cs="Roboto Mono"/>
           <w:color w:val="188038"/>
         </w:rPr>
+        <w:t>id</w:t>
+      </w:r>
+      <w:proofErr w:type="gramEnd"/>
+      <w:r>
+        <w:rPr>
+          <w:rFonts w:ascii="Roboto Mono" w:eastAsia="Roboto Mono" w:hAnsi="Roboto Mono" w:cs="Roboto Mono"/>
+          <w:color w:val="188038"/>
+        </w:rPr>
+        <w:t xml:space="preserve"> [</w:t>
+      </w:r>
+      <w:proofErr w:type="spellStart"/>
+      <w:r>
+        <w:rPr>
+          <w:rFonts w:ascii="Roboto Mono" w:eastAsia="Roboto Mono" w:hAnsi="Roboto Mono" w:cs="Roboto Mono"/>
+          <w:color w:val="188038"/>
+        </w:rPr>
+        <w:t>bigint</w:t>
+      </w:r>
+      <w:proofErr w:type="spellEnd"/>
+      <w:r>
+        <w:rPr>
+          <w:rFonts w:ascii="Roboto Mono" w:eastAsia="Roboto Mono" w:hAnsi="Roboto Mono" w:cs="Roboto Mono"/>
+          <w:color w:val="188038"/>
+        </w:rPr>
+        <w:t>] (</w:t>
+      </w:r>
+      <w:proofErr w:type="spellStart"/>
+      <w:r>
+        <w:rPr>
+          <w:rFonts w:ascii="Roboto Mono" w:eastAsia="Roboto Mono" w:hAnsi="Roboto Mono" w:cs="Roboto Mono"/>
+          <w:color w:val="188038"/>
+        </w:rPr>
+        <w:t>pk</w:t>
+      </w:r>
+      <w:proofErr w:type="spellEnd"/>
+      <w:r>
+        <w:rPr>
+          <w:rFonts w:ascii="Roboto Mono" w:eastAsia="Roboto Mono" w:hAnsi="Roboto Mono" w:cs="Roboto Mono"/>
+          <w:color w:val="188038"/>
+        </w:rPr>
+        <w:t>)</w:t>
+      </w:r>
+    </w:p>
+    <w:p>
+      <w:pPr>
+        <w:pStyle w:val="Normal1"/>
+        <w:rPr>
+          <w:rFonts w:ascii="Roboto Mono" w:eastAsia="Roboto Mono" w:hAnsi="Roboto Mono" w:cs="Roboto Mono"/>
+          <w:color w:val="188038"/>
+        </w:rPr>
+      </w:pPr>
+    </w:p>
+    <w:p>
+      <w:pPr>
+        <w:pStyle w:val="Normal1"/>
+        <w:rPr>
+          <w:rFonts w:ascii="Roboto Mono" w:eastAsia="Roboto Mono" w:hAnsi="Roboto Mono" w:cs="Roboto Mono"/>
+          <w:color w:val="188038"/>
+        </w:rPr>
+      </w:pPr>
+      <w:proofErr w:type="gramStart"/>
+      <w:r>
+        <w:rPr>
+          <w:rFonts w:ascii="Roboto Mono" w:eastAsia="Roboto Mono" w:hAnsi="Roboto Mono" w:cs="Roboto Mono"/>
+          <w:color w:val="188038"/>
+        </w:rPr>
         <w:lastRenderedPageBreak/>
-        <w:t>id</w:t>
-      </w:r>
-      <w:proofErr w:type="gramEnd"/>
-      <w:r>
-        <w:rPr>
-          <w:rFonts w:ascii="Roboto Mono" w:eastAsia="Roboto Mono" w:hAnsi="Roboto Mono" w:cs="Roboto Mono"/>
-          <w:color w:val="188038"/>
-        </w:rPr>
-        <w:t xml:space="preserve"> [</w:t>
-      </w:r>
-      <w:proofErr w:type="spellStart"/>
-      <w:r>
-        <w:rPr>
-          <w:rFonts w:ascii="Roboto Mono" w:eastAsia="Roboto Mono" w:hAnsi="Roboto Mono" w:cs="Roboto Mono"/>
-          <w:color w:val="188038"/>
-        </w:rPr>
-        <w:t>bigint</w:t>
-      </w:r>
-      <w:proofErr w:type="spellEnd"/>
-      <w:r>
-        <w:rPr>
-          <w:rFonts w:ascii="Roboto Mono" w:eastAsia="Roboto Mono" w:hAnsi="Roboto Mono" w:cs="Roboto Mono"/>
-          <w:color w:val="188038"/>
-        </w:rPr>
-        <w:t>] (</w:t>
-      </w:r>
-      <w:proofErr w:type="spellStart"/>
-      <w:r>
-        <w:rPr>
-          <w:rFonts w:ascii="Roboto Mono" w:eastAsia="Roboto Mono" w:hAnsi="Roboto Mono" w:cs="Roboto Mono"/>
-          <w:color w:val="188038"/>
-        </w:rPr>
-        <w:t>pk</w:t>
-      </w:r>
-      <w:proofErr w:type="spellEnd"/>
-      <w:r>
-        <w:rPr>
-          <w:rFonts w:ascii="Roboto Mono" w:eastAsia="Roboto Mono" w:hAnsi="Roboto Mono" w:cs="Roboto Mono"/>
-          <w:color w:val="188038"/>
-        </w:rPr>
-        <w:t>)</w:t>
-      </w:r>
-    </w:p>
-    <w:p>
-      <w:pPr>
-        <w:pStyle w:val="Normal1"/>
-        <w:rPr>
-          <w:rFonts w:ascii="Roboto Mono" w:eastAsia="Roboto Mono" w:hAnsi="Roboto Mono" w:cs="Roboto Mono"/>
-          <w:color w:val="188038"/>
-        </w:rPr>
-      </w:pPr>
-    </w:p>
-    <w:p>
-      <w:pPr>
-        <w:pStyle w:val="Normal1"/>
-        <w:rPr>
-          <w:rFonts w:ascii="Roboto Mono" w:eastAsia="Roboto Mono" w:hAnsi="Roboto Mono" w:cs="Roboto Mono"/>
-          <w:color w:val="188038"/>
-        </w:rPr>
-      </w:pPr>
-      <w:proofErr w:type="gramStart"/>
-      <w:r>
-        <w:rPr>
-          <w:rFonts w:ascii="Roboto Mono" w:eastAsia="Roboto Mono" w:hAnsi="Roboto Mono" w:cs="Roboto Mono"/>
-          <w:color w:val="188038"/>
-        </w:rPr>
         <w:t>name</w:t>
       </w:r>
       <w:proofErr w:type="gramEnd"/>

</xml_diff>